<commit_message>
Lab 5 done i hope
</commit_message>
<xml_diff>
--- a/1c/Лаба-5/ПРИ123-ТИПС-#05-Нямаа.docx
+++ b/1c/Лаба-5/ПРИ123-ТИПС-#05-Нямаа.docx
@@ -1127,31 +1127,13 @@
         <w:rPr>
           <w:sz w:val="28"/>
         </w:rPr>
-        <w:t xml:space="preserve"> Основная схема бизнес-модели была создана в лабораторной работе 1</w:t>
-      </w:r>
-      <w:r>
-        <w:rPr>
-          <w:sz w:val="28"/>
-        </w:rPr>
-        <w:t xml:space="preserve">, </w:t>
-      </w:r>
-      <w:r>
-        <w:rPr>
-          <w:sz w:val="28"/>
-        </w:rPr>
-        <w:t>лабораторной работе 2</w:t>
-      </w:r>
-      <w:r>
-        <w:rPr>
-          <w:sz w:val="28"/>
-        </w:rPr>
-        <w:t xml:space="preserve"> и лабораторной работе 3</w:t>
-      </w:r>
-      <w:r>
-        <w:rPr>
-          <w:sz w:val="28"/>
-        </w:rPr>
-        <w:t>.</w:t>
+        <w:t xml:space="preserve"> Основная схема бизнес-модели была создана в </w:t>
+      </w:r>
+      <w:r>
+        <w:rPr>
+          <w:sz w:val="28"/>
+        </w:rPr>
+        <w:t>лабораторных работах 1-4.</w:t>
       </w:r>
     </w:p>
     <w:p>
@@ -1163,6 +1145,103 @@
           <w:sz w:val="28"/>
         </w:rPr>
       </w:pPr>
+      <w:r>
+        <w:rPr>
+          <w:sz w:val="28"/>
+        </w:rPr>
+        <w:t xml:space="preserve">В ходе выполнения лабораторной работы была создана диаграмма </w:t>
+      </w:r>
+      <w:r>
+        <w:rPr>
+          <w:sz w:val="28"/>
+          <w:lang w:val="en-US"/>
+        </w:rPr>
+        <w:t xml:space="preserve">DFD </w:t>
+      </w:r>
+      <w:r>
+        <w:rPr>
+          <w:sz w:val="28"/>
+        </w:rPr>
+        <w:t>и декомпозиция. Целью модели является нормализовать бизнес-процесс и подробнее рассмотреть хранение данных на каждом этапе</w:t>
+      </w:r>
+      <w:r>
+        <w:rPr>
+          <w:sz w:val="28"/>
+        </w:rPr>
+        <w:t>.</w:t>
+      </w:r>
+      <w:r>
+        <w:rPr>
+          <w:sz w:val="28"/>
+        </w:rPr>
+        <w:t xml:space="preserve"> </w:t>
+      </w:r>
+      <w:r>
+        <w:rPr>
+          <w:sz w:val="28"/>
+        </w:rPr>
+        <w:t>М</w:t>
+      </w:r>
+      <w:r>
+        <w:rPr>
+          <w:sz w:val="28"/>
+        </w:rPr>
+        <w:t>одель отражает точку зрения</w:t>
+      </w:r>
+      <w:r>
+        <w:rPr>
+          <w:sz w:val="28"/>
+        </w:rPr>
+        <w:t xml:space="preserve"> главных</w:t>
+      </w:r>
+      <w:r>
+        <w:rPr>
+          <w:sz w:val="28"/>
+        </w:rPr>
+        <w:t xml:space="preserve"> разработчик</w:t>
+      </w:r>
+      <w:r>
+        <w:rPr>
+          <w:sz w:val="28"/>
+        </w:rPr>
+        <w:t xml:space="preserve">ов, так как отображает последовательность </w:t>
+      </w:r>
+      <w:r>
+        <w:rPr>
+          <w:sz w:val="28"/>
+        </w:rPr>
+        <w:t>выполнения всех процессов и необходимые для</w:t>
+      </w:r>
+      <w:r>
+        <w:rPr>
+          <w:sz w:val="28"/>
+        </w:rPr>
+        <w:t xml:space="preserve"> этих процессов</w:t>
+      </w:r>
+      <w:r>
+        <w:rPr>
+          <w:sz w:val="28"/>
+        </w:rPr>
+        <w:t xml:space="preserve"> </w:t>
+      </w:r>
+      <w:r>
+        <w:rPr>
+          <w:sz w:val="28"/>
+        </w:rPr>
+        <w:t xml:space="preserve">хранимые </w:t>
+      </w:r>
+      <w:r>
+        <w:rPr>
+          <w:sz w:val="28"/>
+        </w:rPr>
+        <w:t>данные, и директора</w:t>
+      </w:r>
+      <w:r>
+        <w:rPr>
+          <w:sz w:val="28"/>
+        </w:rPr>
+        <w:t>, так как ему необходимо знать все бизнес-процессы своей системы.</w:t>
+      </w:r>
     </w:p>
     <w:p>
       <w:pPr>
@@ -1173,46 +1252,37 @@
           <w:sz w:val="28"/>
         </w:rPr>
       </w:pPr>
-    </w:p>
-    <w:p>
-      <w:pPr>
-        <w:spacing w:line="360" w:lineRule="auto"/>
-        <w:jc w:val="center"/>
-        <w:rPr>
-          <w:sz w:val="28"/>
-          <w:szCs w:val="28"/>
-        </w:rPr>
-      </w:pPr>
-      <w:r>
-        <w:rPr>
-          <w:sz w:val="28"/>
-          <w:szCs w:val="28"/>
-        </w:rPr>
-        <w:t xml:space="preserve">Рисунок 1. </w:t>
-      </w:r>
-      <w:r>
-        <w:rPr>
-          <w:sz w:val="28"/>
-          <w:szCs w:val="28"/>
-        </w:rPr>
-        <w:t>Настройка единицы измерения денег и времени.</w:t>
-      </w:r>
-    </w:p>
-    <w:p>
-      <w:pPr>
-        <w:spacing w:line="360" w:lineRule="auto"/>
-        <w:jc w:val="center"/>
-        <w:rPr>
-          <w:sz w:val="28"/>
-          <w:szCs w:val="28"/>
-        </w:rPr>
-      </w:pPr>
-      <w:r>
-        <w:rPr>
-          <w:sz w:val="28"/>
-          <w:szCs w:val="28"/>
-        </w:rPr>
-        <w:t>ВЫВОД К РАБОТЕ:</w:t>
+      <w:r>
+        <w:rPr>
+          <w:sz w:val="28"/>
+        </w:rPr>
+        <w:t>Внешними сущностями системы являются: «Клиент» (отправляет системе запрос, принимает права доступа созданной виртуальной машины), «Система проверки платежей» (возвращает системе договор оказания услуг клиенту и подтверждение оплаты), «Нейросетевой ассистент»</w:t>
+      </w:r>
+      <w:r>
+        <w:rPr>
+          <w:sz w:val="28"/>
+        </w:rPr>
+        <w:t xml:space="preserve"> (получается от системы вопрос от клиента, возвращает </w:t>
+      </w:r>
+      <w:proofErr w:type="spellStart"/>
+      <w:r>
+        <w:rPr>
+          <w:sz w:val="28"/>
+        </w:rPr>
+        <w:t>развернутый</w:t>
+      </w:r>
+      <w:proofErr w:type="spellEnd"/>
+      <w:r>
+        <w:rPr>
+          <w:sz w:val="28"/>
+        </w:rPr>
+        <w:t xml:space="preserve"> ответ на него)</w:t>
+      </w:r>
+      <w:r>
+        <w:rPr>
+          <w:sz w:val="28"/>
+        </w:rPr>
+        <w:t>.</w:t>
       </w:r>
     </w:p>
     <w:p>
@@ -1228,6 +1298,377 @@
         <w:rPr>
           <w:sz w:val="28"/>
         </w:rPr>
+        <w:t>Системе предполагает создание следующих хранилищ: «Запросы клиентов»</w:t>
+      </w:r>
+      <w:r>
+        <w:rPr>
+          <w:sz w:val="28"/>
+        </w:rPr>
+        <w:t xml:space="preserve"> - для хранения информации о всех полученных запросов от </w:t>
+      </w:r>
+      <w:r>
+        <w:rPr>
+          <w:sz w:val="28"/>
+        </w:rPr>
+        <w:lastRenderedPageBreak/>
+        <w:t>клиентов</w:t>
+      </w:r>
+      <w:r>
+        <w:rPr>
+          <w:sz w:val="28"/>
+        </w:rPr>
+        <w:t>, «Договоры»</w:t>
+      </w:r>
+      <w:r>
+        <w:rPr>
+          <w:sz w:val="28"/>
+        </w:rPr>
+        <w:t xml:space="preserve"> - для хранения всех сгенерированных договор</w:t>
+      </w:r>
+      <w:r>
+        <w:rPr>
+          <w:sz w:val="28"/>
+        </w:rPr>
+        <w:t>, «Счета на оплату»</w:t>
+      </w:r>
+      <w:r>
+        <w:rPr>
+          <w:sz w:val="28"/>
+        </w:rPr>
+        <w:t xml:space="preserve"> - для хранения всех сгенерированных счетов на оплату</w:t>
+      </w:r>
+      <w:r>
+        <w:rPr>
+          <w:sz w:val="28"/>
+        </w:rPr>
+        <w:t>, «Клиенты»</w:t>
+      </w:r>
+      <w:r>
+        <w:rPr>
+          <w:sz w:val="28"/>
+        </w:rPr>
+        <w:t xml:space="preserve"> - для хранения данных о клиентах, которые арендовали </w:t>
+      </w:r>
+      <w:r>
+        <w:rPr>
+          <w:sz w:val="28"/>
+          <w:lang w:val="en-US"/>
+        </w:rPr>
+        <w:t>VPS</w:t>
+      </w:r>
+      <w:r>
+        <w:rPr>
+          <w:sz w:val="28"/>
+        </w:rPr>
+        <w:t>, «Свободные ресурсы»</w:t>
+      </w:r>
+      <w:r>
+        <w:rPr>
+          <w:sz w:val="28"/>
+        </w:rPr>
+        <w:t xml:space="preserve"> - для хранения информации о текущих свободных ресурсов</w:t>
+      </w:r>
+      <w:r>
+        <w:rPr>
+          <w:sz w:val="28"/>
+        </w:rPr>
+        <w:t xml:space="preserve">, «Арендованные </w:t>
+      </w:r>
+      <w:r>
+        <w:rPr>
+          <w:sz w:val="28"/>
+          <w:lang w:val="en-US"/>
+        </w:rPr>
+        <w:t>VPS</w:t>
+      </w:r>
+      <w:r>
+        <w:rPr>
+          <w:sz w:val="28"/>
+        </w:rPr>
+        <w:t>»</w:t>
+      </w:r>
+      <w:r>
+        <w:rPr>
+          <w:sz w:val="28"/>
+        </w:rPr>
+        <w:t xml:space="preserve"> - для хранения данных о успешно арендованных </w:t>
+      </w:r>
+      <w:r>
+        <w:rPr>
+          <w:sz w:val="28"/>
+          <w:lang w:val="en-US"/>
+        </w:rPr>
+        <w:t>VPS</w:t>
+      </w:r>
+      <w:r>
+        <w:rPr>
+          <w:sz w:val="28"/>
+        </w:rPr>
+        <w:t>, «Права доступа»</w:t>
+      </w:r>
+      <w:r>
+        <w:rPr>
+          <w:sz w:val="28"/>
+        </w:rPr>
+        <w:t xml:space="preserve"> - для хранения паролей и логинов от арендованных </w:t>
+      </w:r>
+      <w:r>
+        <w:rPr>
+          <w:sz w:val="28"/>
+          <w:lang w:val="en-US"/>
+        </w:rPr>
+        <w:t>VPS</w:t>
+      </w:r>
+      <w:r>
+        <w:rPr>
+          <w:sz w:val="28"/>
+        </w:rPr>
+        <w:t>.</w:t>
+      </w:r>
+      <w:r>
+        <w:rPr>
+          <w:sz w:val="28"/>
+        </w:rPr>
+        <w:t xml:space="preserve">  </w:t>
+      </w:r>
+    </w:p>
+    <w:p>
+      <w:pPr>
+        <w:spacing w:line="360" w:lineRule="auto"/>
+        <w:jc w:val="center"/>
+        <w:rPr>
+          <w:sz w:val="28"/>
+        </w:rPr>
+      </w:pPr>
+      <w:r>
+        <w:rPr>
+          <w:sz w:val="28"/>
+        </w:rPr>
+        <w:drawing>
+          <wp:inline distT="0" distB="0" distL="0" distR="0" wp14:anchorId="6DA6DB11" wp14:editId="48AAEB68">
+            <wp:extent cx="5940425" cy="4105910"/>
+            <wp:effectExtent l="0" t="0" r="0" b="0"/>
+            <wp:docPr id="1" name="Рисунок 1"/>
+            <wp:cNvGraphicFramePr>
+              <a:graphicFrameLocks xmlns:a="http://schemas.openxmlformats.org/drawingml/2006/main" noChangeAspect="1"/>
+            </wp:cNvGraphicFramePr>
+            <a:graphic xmlns:a="http://schemas.openxmlformats.org/drawingml/2006/main">
+              <a:graphicData uri="http://schemas.openxmlformats.org/drawingml/2006/picture">
+                <pic:pic xmlns:pic="http://schemas.openxmlformats.org/drawingml/2006/picture">
+                  <pic:nvPicPr>
+                    <pic:cNvPr id="1" name=""/>
+                    <pic:cNvPicPr/>
+                  </pic:nvPicPr>
+                  <pic:blipFill>
+                    <a:blip r:embed="rId7"/>
+                    <a:stretch>
+                      <a:fillRect/>
+                    </a:stretch>
+                  </pic:blipFill>
+                  <pic:spPr>
+                    <a:xfrm>
+                      <a:off x="0" y="0"/>
+                      <a:ext cx="5940425" cy="4105910"/>
+                    </a:xfrm>
+                    <a:prstGeom prst="rect">
+                      <a:avLst/>
+                    </a:prstGeom>
+                  </pic:spPr>
+                </pic:pic>
+              </a:graphicData>
+            </a:graphic>
+          </wp:inline>
+        </w:drawing>
+      </w:r>
+    </w:p>
+    <w:p>
+      <w:pPr>
+        <w:spacing w:line="360" w:lineRule="auto"/>
+        <w:jc w:val="center"/>
+        <w:rPr>
+          <w:sz w:val="28"/>
+          <w:szCs w:val="28"/>
+        </w:rPr>
+      </w:pPr>
+      <w:r>
+        <w:rPr>
+          <w:sz w:val="28"/>
+          <w:szCs w:val="28"/>
+        </w:rPr>
+        <w:t xml:space="preserve">Рисунок 1. </w:t>
+      </w:r>
+      <w:r>
+        <w:rPr>
+          <w:sz w:val="28"/>
+          <w:szCs w:val="28"/>
+        </w:rPr>
+        <w:t xml:space="preserve">Построенная диаграмма </w:t>
+      </w:r>
+      <w:r>
+        <w:rPr>
+          <w:sz w:val="28"/>
+          <w:szCs w:val="28"/>
+          <w:lang w:val="en-US"/>
+        </w:rPr>
+        <w:t>DFD.</w:t>
+      </w:r>
+    </w:p>
+    <w:p>
+      <w:pPr>
+        <w:spacing w:line="360" w:lineRule="auto"/>
+        <w:jc w:val="center"/>
+        <w:rPr>
+          <w:sz w:val="28"/>
+          <w:szCs w:val="28"/>
+        </w:rPr>
+      </w:pPr>
+    </w:p>
+    <w:p>
+      <w:pPr>
+        <w:spacing w:line="360" w:lineRule="auto"/>
+        <w:jc w:val="center"/>
+        <w:rPr>
+          <w:sz w:val="28"/>
+          <w:szCs w:val="28"/>
+        </w:rPr>
+      </w:pPr>
+      <w:r>
+        <w:rPr>
+          <w:sz w:val="28"/>
+          <w:szCs w:val="28"/>
+        </w:rPr>
+        <w:lastRenderedPageBreak/>
+        <w:drawing>
+          <wp:inline distT="0" distB="0" distL="0" distR="0" wp14:anchorId="12506F1E" wp14:editId="67B71F19">
+            <wp:extent cx="5940425" cy="4112260"/>
+            <wp:effectExtent l="0" t="0" r="0" b="0"/>
+            <wp:docPr id="3" name="Рисунок 3"/>
+            <wp:cNvGraphicFramePr>
+              <a:graphicFrameLocks xmlns:a="http://schemas.openxmlformats.org/drawingml/2006/main" noChangeAspect="1"/>
+            </wp:cNvGraphicFramePr>
+            <a:graphic xmlns:a="http://schemas.openxmlformats.org/drawingml/2006/main">
+              <a:graphicData uri="http://schemas.openxmlformats.org/drawingml/2006/picture">
+                <pic:pic xmlns:pic="http://schemas.openxmlformats.org/drawingml/2006/picture">
+                  <pic:nvPicPr>
+                    <pic:cNvPr id="1" name=""/>
+                    <pic:cNvPicPr/>
+                  </pic:nvPicPr>
+                  <pic:blipFill>
+                    <a:blip r:embed="rId8"/>
+                    <a:stretch>
+                      <a:fillRect/>
+                    </a:stretch>
+                  </pic:blipFill>
+                  <pic:spPr>
+                    <a:xfrm>
+                      <a:off x="0" y="0"/>
+                      <a:ext cx="5940425" cy="4112260"/>
+                    </a:xfrm>
+                    <a:prstGeom prst="rect">
+                      <a:avLst/>
+                    </a:prstGeom>
+                  </pic:spPr>
+                </pic:pic>
+              </a:graphicData>
+            </a:graphic>
+          </wp:inline>
+        </w:drawing>
+      </w:r>
+    </w:p>
+    <w:p>
+      <w:pPr>
+        <w:spacing w:line="360" w:lineRule="auto"/>
+        <w:jc w:val="center"/>
+        <w:rPr>
+          <w:sz w:val="28"/>
+          <w:szCs w:val="28"/>
+        </w:rPr>
+      </w:pPr>
+      <w:r>
+        <w:rPr>
+          <w:sz w:val="28"/>
+          <w:szCs w:val="28"/>
+        </w:rPr>
+        <w:t xml:space="preserve">Рисунок </w:t>
+      </w:r>
+      <w:r>
+        <w:rPr>
+          <w:sz w:val="28"/>
+          <w:szCs w:val="28"/>
+        </w:rPr>
+        <w:t>2</w:t>
+      </w:r>
+      <w:r>
+        <w:rPr>
+          <w:sz w:val="28"/>
+          <w:szCs w:val="28"/>
+        </w:rPr>
+        <w:t xml:space="preserve">. </w:t>
+      </w:r>
+      <w:r>
+        <w:rPr>
+          <w:sz w:val="28"/>
+          <w:szCs w:val="28"/>
+        </w:rPr>
+        <w:t xml:space="preserve">Декомпозированная диаграмма </w:t>
+      </w:r>
+      <w:r>
+        <w:rPr>
+          <w:sz w:val="28"/>
+          <w:szCs w:val="28"/>
+          <w:lang w:val="en-US"/>
+        </w:rPr>
+        <w:t>DFD</w:t>
+      </w:r>
+      <w:r>
+        <w:rPr>
+          <w:sz w:val="28"/>
+          <w:szCs w:val="28"/>
+          <w:lang w:val="en-US"/>
+        </w:rPr>
+        <w:t>.</w:t>
+      </w:r>
+    </w:p>
+    <w:p>
+      <w:pPr>
+        <w:spacing w:line="360" w:lineRule="auto"/>
+        <w:jc w:val="center"/>
+        <w:rPr>
+          <w:sz w:val="28"/>
+          <w:szCs w:val="28"/>
+        </w:rPr>
+      </w:pPr>
+    </w:p>
+    <w:p>
+      <w:pPr>
+        <w:spacing w:line="360" w:lineRule="auto"/>
+        <w:jc w:val="center"/>
+        <w:rPr>
+          <w:sz w:val="28"/>
+          <w:szCs w:val="28"/>
+        </w:rPr>
+      </w:pPr>
+      <w:r>
+        <w:rPr>
+          <w:sz w:val="28"/>
+          <w:szCs w:val="28"/>
+        </w:rPr>
+        <w:t>ВЫВОД К РАБОТЕ:</w:t>
+      </w:r>
+    </w:p>
+    <w:p>
+      <w:pPr>
+        <w:spacing w:line="360" w:lineRule="auto"/>
+        <w:ind w:firstLine="709"/>
+        <w:jc w:val="both"/>
+        <w:rPr>
+          <w:sz w:val="28"/>
+        </w:rPr>
+      </w:pPr>
+      <w:r>
+        <w:rPr>
+          <w:sz w:val="28"/>
+        </w:rPr>
         <w:t>Я о</w:t>
       </w:r>
       <w:r>
@@ -1240,13 +1681,7 @@
         <w:rPr>
           <w:sz w:val="28"/>
         </w:rPr>
-        <w:t>и</w:t>
-      </w:r>
-      <w:r>
-        <w:rPr>
-          <w:sz w:val="28"/>
-        </w:rPr>
-        <w:t>л</w:t>
+        <w:t>ил</w:t>
       </w:r>
       <w:r>
         <w:rPr>
@@ -1268,9 +1703,9 @@
       </w:r>
     </w:p>
     <w:sectPr>
-      <w:footerReference w:type="even" r:id="rId7"/>
-      <w:footerReference w:type="default" r:id="rId8"/>
-      <w:footerReference w:type="first" r:id="rId9"/>
+      <w:footerReference w:type="even" r:id="rId9"/>
+      <w:footerReference w:type="default" r:id="rId10"/>
+      <w:footerReference w:type="first" r:id="rId11"/>
       <w:pgSz w:w="11906" w:h="16838"/>
       <w:pgMar w:top="1134" w:right="850" w:bottom="1134" w:left="1701" w:header="0" w:footer="708" w:gutter="0"/>
       <w:cols w:space="720"/>
@@ -1993,7 +2428,7 @@
   <w:style w:type="paragraph" w:default="1" w:styleId="a">
     <w:name w:val="Normal"/>
     <w:qFormat/>
-    <w:rsid w:val="008A62F0"/>
+    <w:rsid w:val="009E0380"/>
     <w:pPr>
       <w:widowControl w:val="0"/>
     </w:pPr>
@@ -2028,6 +2463,7 @@
   <w:style w:type="character" w:default="1" w:styleId="a0">
     <w:name w:val="Default Paragraph Font"/>
     <w:uiPriority w:val="1"/>
+    <w:semiHidden/>
     <w:unhideWhenUsed/>
   </w:style>
   <w:style w:type="table" w:default="1" w:styleId="a1">

</xml_diff>